<commit_message>
omments, chat and live updates
</commit_message>
<xml_diff>
--- a/contract-platform-v1-spec (1).docx
+++ b/contract-platform-v1-spec (1).docx
@@ -2642,6 +2642,32 @@
         <w:spacing w:after="80"/>
       </w:pPr>
       <w:r>
+        <w:t xml:space="preserve">Authors can edit and delete their own comments and chat messages at any time. An edited message shows "(edited)". A deleted message leaves a "Message deleted" note (author and time kept, text removed).</w:t>
+      </w:r>
+    </w:p>
+    <w:p>
+      <w:pPr>
+        <w:pStyle w:val="ListParagraph"/>
+        <w:numPr>
+          <w:ilvl w:val="0"/>
+          <w:numId w:val="3"/>
+        </w:numPr>
+        <w:spacing w:after="80"/>
+      </w:pPr>
+      <w:r>
+        <w:t xml:space="preserve">Anyone who can see a thread can resolve or reopen it: either side for Shared threads, only the owning side for Internal threads. A resolved thread shows who resolved it and when, and moves to a Resolved list.</w:t>
+      </w:r>
+    </w:p>
+    <w:p>
+      <w:pPr>
+        <w:pStyle w:val="ListParagraph"/>
+        <w:numPr>
+          <w:ilvl w:val="0"/>
+          <w:numId w:val="3"/>
+        </w:numPr>
+        <w:spacing w:after="80"/>
+      </w:pPr>
+      <w:r>
         <w:t xml:space="preserve">Filtering happens on the server. Real-time updates use Server-Sent Events (SSE) with a separate stream per side, so internal messages are never delivered to the other side.</w:t>
       </w:r>
     </w:p>
@@ -3664,7 +3690,7 @@
           </w:tcPr>
           <w:p>
             <w:r>
-              <w:t xml:space="preserve">id, contractId, changeId?, partyId, visibility (SHARED | INTERNAL), status (OPEN | RESOLVED | OUTDATED)</w:t>
+              <w:t xml:space="preserve">id, contractId, changeId?, partyId, visibility (SHARED | INTERNAL), status (OPEN | RESOLVED | OUTDATED), resolvedByUserId?, resolvedAt?</w:t>
             </w:r>
           </w:p>
         </w:tc>
@@ -3686,7 +3712,7 @@
           </w:tcPr>
           <w:p>
             <w:r>
-              <w:t xml:space="preserve">text threads are anchored by a comment mark in the node tree</w:t>
+              <w:t xml:space="preserve">text threads store the quoted text plus ~30 characters either side (quote, prefix, suffix); nothing is added to the node tree, so internal threads leave no trace in the document. Change threads keep only the quote (prefix/suffix null).</w:t>
             </w:r>
           </w:p>
         </w:tc>
@@ -3732,7 +3758,7 @@
           </w:tcPr>
           <w:p>
             <w:r>
-              <w:t xml:space="preserve">id, threadId, authorUserId, body, createdAt</w:t>
+              <w:t xml:space="preserve">id, threadId, authorUserId, body, createdAt, editedAt?, deletedAt?</w:t>
             </w:r>
           </w:p>
         </w:tc>
@@ -3796,7 +3822,7 @@
           </w:tcPr>
           <w:p>
             <w:r>
-              <w:t xml:space="preserve">id, contractId, authorUserId, partyId, visibility, body, createdAt</w:t>
+              <w:t xml:space="preserve">id, contractId, authorUserId, partyId, visibility, body, createdAt, editedAt?, deletedAt?</w:t>
             </w:r>
           </w:p>
         </w:tc>
@@ -4407,7 +4433,7 @@
           </w:tcPr>
           <w:p>
             <w:r>
-              <w:t xml:space="preserve">comment</w:t>
+              <w:t xml:space="preserve">comment highlight (not stored)</w:t>
             </w:r>
           </w:p>
         </w:tc>
@@ -4451,7 +4477,7 @@
           </w:tcPr>
           <w:p>
             <w:r>
-              <w:t xml:space="preserve">highlight; opens the thread</w:t>
+              <w:t xml:space="preserve">drawn by the editor where the thread's quote is found; opens the thread. Not found: thread shows Outdated.</w:t>
             </w:r>
           </w:p>
         </w:tc>

</xml_diff>

<commit_message>
both sides clicking Ready to sign with signature spots, Reopen, choosing signers and export
</commit_message>
<xml_diff>
--- a/contract-platform-v1-spec (1).docx
+++ b/contract-platform-v1-spec (1).docx
@@ -2017,7 +2017,7 @@
           </w:tcPr>
           <w:p>
             <w:r>
-              <w:t xml:space="preserve">All changes resolved; e-signature can start.</w:t>
+              <w:t xml:space="preserve">Both sides clicked Ready to sign; signing in progress.</w:t>
             </w:r>
           </w:p>
         </w:tc>
@@ -2753,7 +2753,237 @@
         <w:spacing w:after="80"/>
       </w:pPr>
       <w:r>
-        <w:t xml:space="preserve">E-signature and export are </w:t>
+        <w:rPr>
+          <w:b/>
+          <w:bCs/>
+        </w:rPr>
+        <w:t xml:space="preserve">Ready to sign button.</w:t>
+      </w:r>
+      <w:r>
+        <w:t xml:space="preserve"> Available after the first send and only when no changes are pending. Any member of a side can click it for that side; either side can go first. The clicked side sees "Waiting for [other side]" and can </w:t>
+      </w:r>
+      <w:r>
+        <w:rPr>
+          <w:b/>
+          <w:bCs/>
+        </w:rPr>
+        <w:t xml:space="preserve">Undo ready</w:t>
+      </w:r>
+      <w:r>
+        <w:t xml:space="preserve"> until the other side also clicks. Any saved text change clears both clicks.</w:t>
+      </w:r>
+    </w:p>
+    <w:p>
+      <w:pPr>
+        <w:pStyle w:val="ListParagraph"/>
+        <w:numPr>
+          <w:ilvl w:val="0"/>
+          <w:numId w:val="3"/>
+        </w:numPr>
+        <w:spacing w:after="80"/>
+      </w:pPr>
+      <w:r>
+        <w:rPr>
+          <w:b/>
+          <w:bCs/>
+        </w:rPr>
+        <w:t xml:space="preserve">Signature placement.</w:t>
+      </w:r>
+      <w:r>
+        <w:t xml:space="preserve"> When the proposer clicks Ready to sign, they choose for both sides: </w:t>
+      </w:r>
+      <w:r>
+        <w:rPr>
+          <w:b/>
+          <w:bCs/>
+        </w:rPr>
+        <w:t xml:space="preserve">Place signature spots</w:t>
+      </w:r>
+      <w:r>
+        <w:t xml:space="preserve"> or </w:t>
+      </w:r>
+      <w:r>
+        <w:rPr>
+          <w:b/>
+          <w:bCs/>
+        </w:rPr>
+        <w:t xml:space="preserve">Use a signature page</w:t>
+      </w:r>
+      <w:r>
+        <w:t xml:space="preserve"> (added at the end).</w:t>
+      </w:r>
+    </w:p>
+    <w:p>
+      <w:pPr>
+        <w:pStyle w:val="ListParagraph"/>
+        <w:numPr>
+          <w:ilvl w:val="0"/>
+          <w:numId w:val="3"/>
+        </w:numPr>
+        <w:spacing w:after="80"/>
+      </w:pPr>
+      <w:r>
+        <w:rPr>
+          <w:b/>
+          <w:bCs/>
+        </w:rPr>
+        <w:t xml:space="preserve">Placing mode.</w:t>
+      </w:r>
+      <w:r>
+        <w:t xml:space="preserve"> The only action allowed is placing spots: "Click where [proposer] signs", then "Click where [counterparty] signs", then Move / Done. No typing; works on either side’s turn. Spots are not redlines: untracked, proposer-only. The counterparty sees them read-only and raises objections in chat. If the counterparty clicked Ready first, placing spots does not clear their click; their window says "[Proposer] will choose where signatures go. You’ll see it before you sign."</w:t>
+      </w:r>
+    </w:p>
+    <w:p>
+      <w:pPr>
+        <w:pStyle w:val="ListParagraph"/>
+        <w:numPr>
+          <w:ilvl w:val="0"/>
+          <w:numId w:val="3"/>
+        </w:numPr>
+        <w:spacing w:after="80"/>
+      </w:pPr>
+      <w:r>
+        <w:rPr>
+          <w:b/>
+          <w:bCs/>
+        </w:rPr>
+        <w:t xml:space="preserve">What goes on the PDF.</w:t>
+      </w:r>
+      <w:r>
+        <w:t xml:space="preserve"> A spot becomes a signature box only; name, title and date lines come from the contract’s own wording. The added signature page has, per side, a "For [organisation]" label, a signature box and a date filled in on signing. No person’s name is printed.</w:t>
+      </w:r>
+    </w:p>
+    <w:p>
+      <w:pPr>
+        <w:pStyle w:val="ListParagraph"/>
+        <w:numPr>
+          <w:ilvl w:val="0"/>
+          <w:numId w:val="3"/>
+        </w:numPr>
+        <w:spacing w:after="80"/>
+      </w:pPr>
+      <w:r>
+        <w:rPr>
+          <w:b/>
+          <w:bCs/>
+        </w:rPr>
+        <w:t xml:space="preserve">Both clicked → Ready to sign.</w:t>
+      </w:r>
+      <w:r>
+        <w:t xml:space="preserve"> Editing, sending, upload and restore are blocked; comments and chat still work. A clean PDF (no redlines) is built and sent to the e-signature provider.</w:t>
+      </w:r>
+    </w:p>
+    <w:p>
+      <w:pPr>
+        <w:pStyle w:val="ListParagraph"/>
+        <w:numPr>
+          <w:ilvl w:val="0"/>
+          <w:numId w:val="3"/>
+        </w:numPr>
+        <w:spacing w:after="80"/>
+      </w:pPr>
+      <w:r>
+        <w:rPr>
+          <w:b/>
+          <w:bCs/>
+        </w:rPr>
+        <w:t xml:space="preserve">Signers.</w:t>
+      </w:r>
+      <w:r>
+        <w:t xml:space="preserve"> One signer per side. Default: the contract creator (proposer) and the counterparty contact email from onboarding. Any member of a side can switch its signer to another member of that side, until that side has signed. If the other side has already signed, the switch warns that names in the contract text may no longer match and the text can’t change without Reopen. Only the chosen signer sees </w:t>
+      </w:r>
+      <w:r>
+        <w:rPr>
+          <w:b/>
+          <w:bCs/>
+        </w:rPr>
+        <w:t xml:space="preserve">Sign</w:t>
+      </w:r>
+      <w:r>
+        <w:t xml:space="preserve">; others see "Waiting for [name] to sign".</w:t>
+      </w:r>
+    </w:p>
+    <w:p>
+      <w:pPr>
+        <w:pStyle w:val="ListParagraph"/>
+        <w:numPr>
+          <w:ilvl w:val="0"/>
+          <w:numId w:val="3"/>
+        </w:numPr>
+        <w:spacing w:after="80"/>
+      </w:pPr>
+      <w:r>
+        <w:rPr>
+          <w:b/>
+          <w:bCs/>
+        </w:rPr>
+        <w:t xml:space="preserve">E-signature provider: DocuSeal, self-hosted.</w:t>
+      </w:r>
+      <w:r>
+        <w:t xml:space="preserve"> The signing form is embedded in the contract page; the provider sends no emails. Identity, timestamps and audit trail are recorded by DocuSeal.</w:t>
+      </w:r>
+    </w:p>
+    <w:p>
+      <w:pPr>
+        <w:pStyle w:val="ListParagraph"/>
+        <w:numPr>
+          <w:ilvl w:val="0"/>
+          <w:numId w:val="3"/>
+        </w:numPr>
+        <w:spacing w:after="80"/>
+      </w:pPr>
+      <w:r>
+        <w:rPr>
+          <w:b/>
+          <w:bCs/>
+        </w:rPr>
+        <w:t xml:space="preserve">Reopen.</w:t>
+      </w:r>
+      <w:r>
+        <w:t xml:space="preserve"> Allowed from both sides clicking Ready until both have signed; after one side signs, only the side still to sign can Reopen. The document does not change. The signing request is cancelled (any signature discarded), both clicks are cleared, the turn goes to the side that reopened, and spots are kept. After further changes both click Ready again, a new PDF is built, and both sign again.</w:t>
+      </w:r>
+    </w:p>
+    <w:p>
+      <w:pPr>
+        <w:pStyle w:val="ListParagraph"/>
+        <w:numPr>
+          <w:ilvl w:val="0"/>
+          <w:numId w:val="3"/>
+        </w:numPr>
+        <w:spacing w:after="80"/>
+      </w:pPr>
+      <w:r>
+        <w:t xml:space="preserve">Once both have signed, the contract is </w:t>
+      </w:r>
+      <w:r>
+        <w:rPr>
+          <w:b/>
+          <w:bCs/>
+        </w:rPr>
+        <w:t xml:space="preserve">locked</w:t>
+      </w:r>
+      <w:r>
+        <w:t xml:space="preserve">, the signed PDF is stored and its hash saved. Both sides can download it.</w:t>
+      </w:r>
+    </w:p>
+    <w:p>
+      <w:pPr>
+        <w:pStyle w:val="ListParagraph"/>
+        <w:numPr>
+          <w:ilvl w:val="0"/>
+          <w:numId w:val="3"/>
+        </w:numPr>
+        <w:spacing w:after="80"/>
+      </w:pPr>
+      <w:r>
+        <w:rPr>
+          <w:b/>
+          <w:bCs/>
+        </w:rPr>
+        <w:t xml:space="preserve">Export.</w:t>
+      </w:r>
+      <w:r>
+        <w:t xml:space="preserve"> Clean copy (no red/green) as Word or PDF. E-signature and export are </w:t>
       </w:r>
       <w:r>
         <w:rPr>
@@ -2763,53 +2993,7 @@
         <w:t xml:space="preserve">blocked while any change is unresolved</w:t>
       </w:r>
       <w:r>
-        <w:t xml:space="preserve">. The user sees an error that changes are still pending.</w:t>
-      </w:r>
-    </w:p>
-    <w:p>
-      <w:pPr>
-        <w:pStyle w:val="ListParagraph"/>
-        <w:numPr>
-          <w:ilvl w:val="0"/>
-          <w:numId w:val="3"/>
-        </w:numPr>
-        <w:spacing w:after="80"/>
-      </w:pPr>
-      <w:r>
-        <w:t xml:space="preserve">E-signature is handled through a </w:t>
-      </w:r>
-      <w:r>
-        <w:rPr>
-          <w:b/>
-          <w:bCs/>
-        </w:rPr>
-        <w:t xml:space="preserve">third-party provider</w:t>
-      </w:r>
-      <w:r>
-        <w:t xml:space="preserve"> (e.g. DocuSign, Dropbox Sign) for identity, timestamps, and audit trail. Provider not yet chosen.</w:t>
-      </w:r>
-    </w:p>
-    <w:p>
-      <w:pPr>
-        <w:pStyle w:val="ListParagraph"/>
-        <w:numPr>
-          <w:ilvl w:val="0"/>
-          <w:numId w:val="3"/>
-        </w:numPr>
-        <w:spacing w:after="80"/>
-      </w:pPr>
-      <w:r>
-        <w:t xml:space="preserve">Once signed, the contract is </w:t>
-      </w:r>
-      <w:r>
-        <w:rPr>
-          <w:b/>
-          <w:bCs/>
-        </w:rPr>
-        <w:t xml:space="preserve">locked</w:t>
-      </w:r>
-      <w:r>
-        <w:t xml:space="preserve"> and the hash of the signed document is stored.</w:t>
+        <w:t xml:space="preserve">: the user sees an error that changes are still pending. Spots appear as blank signature lines.</w:t>
       </w:r>
     </w:p>
     <w:p>
@@ -2886,7 +3070,30 @@
         <w:t xml:space="preserve">ready to sign</w:t>
       </w:r>
       <w:r>
-        <w:t xml:space="preserve"> (to both sides, when the last pending change is resolved).</w:t>
+        <w:t xml:space="preserve"> (to both sides, when both have clicked Ready to sign). No email when only one side clicks.</w:t>
+      </w:r>
+    </w:p>
+    <w:p>
+      <w:pPr>
+        <w:pStyle w:val="ListParagraph"/>
+        <w:numPr>
+          <w:ilvl w:val="0"/>
+          <w:numId w:val="3"/>
+        </w:numPr>
+        <w:spacing w:after="80"/>
+      </w:pPr>
+      <w:r>
+        <w:t xml:space="preserve">Email on </w:t>
+      </w:r>
+      <w:r>
+        <w:rPr>
+          <w:b/>
+          <w:bCs/>
+        </w:rPr>
+        <w:t xml:space="preserve">reopen</w:t>
+      </w:r>
+      <w:r>
+        <w:t xml:space="preserve"> (to both sides; says if a signature was discarded).</w:t>
       </w:r>
     </w:p>
     <w:p>
@@ -3222,7 +3429,7 @@
           </w:tcPr>
           <w:p>
             <w:r>
-              <w:t xml:space="preserve">id, title, status, currentTurnPartyId, draftContent (JSONB), createdById, timestamps</w:t>
+              <w:t xml:space="preserve">id, title, status, currentTurnPartyId, draftContent (JSONB), signaturePlacement (SPOTS | PAGE)?, createdById, timestamps</w:t>
             </w:r>
           </w:p>
         </w:tc>
@@ -3290,7 +3497,7 @@
           </w:tcPr>
           <w:p>
             <w:r>
-              <w:t xml:space="preserve">id, contractId, role (PROPOSER | COUNTERPARTY), orgName</w:t>
+              <w:t xml:space="preserve">id, contractId, role (PROPOSER | COUNTERPARTY), orgName, readyAt?, readyByUserId?, signerUserId?</w:t>
             </w:r>
           </w:p>
         </w:tc>
@@ -3954,7 +4161,7 @@
           </w:tcPr>
           <w:p>
             <w:r>
-              <w:t xml:space="preserve">id, contractId, versionId, provider, externalId, status, signedDocHash</w:t>
+              <w:t xml:space="preserve">id, contractId, versionId, provider, externalId, status (PENDING | COMPLETED | CANCELLED), signedFileKey?, signedDocHash</w:t>
             </w:r>
           </w:p>
         </w:tc>
@@ -4136,7 +4343,7 @@
         <w:t xml:space="preserve">Ready to sign</w:t>
       </w:r>
       <w:r>
-        <w:t xml:space="preserve"> requires zero PENDING changes.</w:t>
+        <w:t xml:space="preserve"> requires both parties’ readyAt set; Ready can only be clicked with zero PENDING changes. Saving a text change clears both readyAt.</w:t>
       </w:r>
     </w:p>
     <w:p>
@@ -4478,6 +4685,74 @@
           <w:p>
             <w:r>
               <w:t xml:space="preserve">drawn by the editor where the thread's quote is found; opens the thread. Not found: thread shows Outdated.</w:t>
+            </w:r>
+          </w:p>
+        </w:tc>
+      </w:tr>
+      <w:tr>
+        <w:tc>
+          <w:tcPr>
+            <w:tcW w:type="dxa" w:w="1900"/>
+            <w:tcBorders>
+              <w:top w:val="single" w:color="BFBFBF" w:sz="4"/>
+              <w:left w:val="single" w:color="BFBFBF" w:sz="4"/>
+              <w:bottom w:val="single" w:color="BFBFBF" w:sz="4"/>
+              <w:right w:val="single" w:color="BFBFBF" w:sz="4"/>
+            </w:tcBorders>
+            <w:tcMar>
+              <w:top w:type="dxa" w:w="80"/>
+              <w:left w:type="dxa" w:w="120"/>
+              <w:bottom w:type="dxa" w:w="80"/>
+              <w:right w:type="dxa" w:w="120"/>
+            </w:tcMar>
+          </w:tcPr>
+          <w:p>
+            <w:r>
+              <w:t xml:space="preserve">signatureSpot (inline node, untracked)</w:t>
+            </w:r>
+          </w:p>
+        </w:tc>
+        <w:tc>
+          <w:tcPr>
+            <w:tcW w:type="dxa" w:w="4026"/>
+            <w:tcBorders>
+              <w:top w:val="single" w:color="BFBFBF" w:sz="4"/>
+              <w:left w:val="single" w:color="BFBFBF" w:sz="4"/>
+              <w:bottom w:val="single" w:color="BFBFBF" w:sz="4"/>
+              <w:right w:val="single" w:color="BFBFBF" w:sz="4"/>
+            </w:tcBorders>
+            <w:tcMar>
+              <w:top w:type="dxa" w:w="80"/>
+              <w:left w:type="dxa" w:w="120"/>
+              <w:bottom w:type="dxa" w:w="80"/>
+              <w:right w:type="dxa" w:w="120"/>
+            </w:tcMar>
+          </w:tcPr>
+          <w:p>
+            <w:r>
+              <w:t xml:space="preserve">role (PROPOSER | COUNTERPARTY)</w:t>
+            </w:r>
+          </w:p>
+        </w:tc>
+        <w:tc>
+          <w:tcPr>
+            <w:tcW w:type="dxa" w:w="3100"/>
+            <w:tcBorders>
+              <w:top w:val="single" w:color="BFBFBF" w:sz="4"/>
+              <w:left w:val="single" w:color="BFBFBF" w:sz="4"/>
+              <w:bottom w:val="single" w:color="BFBFBF" w:sz="4"/>
+              <w:right w:val="single" w:color="BFBFBF" w:sz="4"/>
+            </w:tcBorders>
+            <w:tcMar>
+              <w:top w:type="dxa" w:w="80"/>
+              <w:left w:type="dxa" w:w="120"/>
+              <w:bottom w:type="dxa" w:w="80"/>
+              <w:right w:type="dxa" w:w="120"/>
+            </w:tcMar>
+          </w:tcPr>
+          <w:p>
+            <w:r>
+              <w:t xml:space="preserve">chip "[Org] signs here"; placed only by the proposer in placing mode; becomes a signature box in the signing PDF</w:t>
             </w:r>
           </w:p>
         </w:tc>

</xml_diff>

<commit_message>
signing now happens inside the app (draw, type or upload a signature), and the tests pass
</commit_message>
<xml_diff>
--- a/contract-platform-v1-spec (1).docx
+++ b/contract-platform-v1-spec (1).docx
@@ -2760,7 +2760,7 @@
         <w:t xml:space="preserve">Ready to sign button.</w:t>
       </w:r>
       <w:r>
-        <w:t xml:space="preserve"> Available after the first send and only when no changes are pending. Any member of a side can click it for that side; either side can go first. The clicked side sees "Waiting for [other side]" and can </w:t>
+        <w:t xml:space="preserve"> Available after the first send, only when no changes are pending and the latest version has been sent (no unsent edits), so the other side agrees to text they have seen. Any member of a side can click it for that side; either side can go first. The clicked side sees "Waiting for [other side]" and can </w:t>
       </w:r>
       <w:r>
         <w:rPr>
@@ -2830,7 +2830,7 @@
         <w:t xml:space="preserve">Placing mode.</w:t>
       </w:r>
       <w:r>
-        <w:t xml:space="preserve"> The only action allowed is placing spots: "Click where [proposer] signs", then "Click where [counterparty] signs", then Move / Done. No typing; works on either side’s turn. Spots are not redlines: untracked, proposer-only. The counterparty sees them read-only and raises objections in chat. If the counterparty clicked Ready first, placing spots does not clear their click; their window says "[Proposer] will choose where signatures go. You’ll see it before you sign."</w:t>
+        <w:t xml:space="preserve"> The only action allowed is placing spots: "Click where [proposer] signs", then "Click where [counterparty] signs", then Move / Done. No typing; works on either side’s turn. In the editor a spot is a small ✍ icon with a “[Org] signs here” label above the line; it adds no text to the document and can’t be deleted or copied while editing. Spots are not redlines: untracked, proposer-only. The counterparty sees them read-only and raises objections in chat. If the counterparty clicked Ready first, placing spots does not clear their click; their window says "[Proposer] will choose where signatures go. You’ll see it before you sign."</w:t>
       </w:r>
     </w:p>
     <w:p>
@@ -2993,7 +2993,7 @@
         <w:t xml:space="preserve">blocked while any change is unresolved</w:t>
       </w:r>
       <w:r>
-        <w:t xml:space="preserve">: the user sees an error that changes are still pending. Spots appear as blank signature lines.</w:t>
+        <w:t xml:space="preserve">: the user sees an error that changes are still pending. Spots add nothing to an export.</w:t>
       </w:r>
     </w:p>
     <w:p>

</xml_diff>

<commit_message>
build and contract docx update
</commit_message>
<xml_diff>
--- a/contract-platform-v1-spec (1).docx
+++ b/contract-platform-v1-spec (1).docx
@@ -2870,7 +2870,7 @@
         <w:t xml:space="preserve">Both clicked → Ready to sign.</w:t>
       </w:r>
       <w:r>
-        <w:t xml:space="preserve"> Editing, sending, upload and restore are blocked; comments and chat still work. A clean PDF (no redlines) is built and sent to the e-signature provider.</w:t>
+        <w:t xml:space="preserve"> Editing, sending, upload and restore are blocked; comments and chat still work. A clean PDF (no redlines) is built, stored and fingerprinted (SHA-256) as the document both sides sign.</w:t>
       </w:r>
     </w:p>
     <w:p>
@@ -2917,10 +2917,10 @@
           <w:b/>
           <w:bCs/>
         </w:rPr>
-        <w:t xml:space="preserve">E-signature provider: DocuSeal, self-hosted.</w:t>
-      </w:r>
-      <w:r>
-        <w:t xml:space="preserve"> The signing form is embedded in the contract page; the provider sends no emails. Identity, timestamps and audit trail are recorded by DocuSeal.</w:t>
+        <w:t xml:space="preserve">Signing (our own; no outside provider).</w:t>
+      </w:r>
+      <w:r>
+        <w:t xml:space="preserve"> The chosen signer opens the Sign window on the contract page, reads the document to sign, and signs by drawing, typing their name (shown in a handwriting font) or uploading an image of their signature (white background removed). They tick “I agree this is my signature and that I’m signing this contract for [organisation]”. The platform records signer, side, time, IP address, browser, method and the fingerprint of the document signed. “Don’t sign. Reopen instead” acts as Reopen. These are simple electronic signatures: the evidence is the platform’s records (email login code, times, fingerprints).</w:t>
       </w:r>
     </w:p>
     <w:p>
@@ -2940,7 +2940,7 @@
         <w:t xml:space="preserve">Reopen.</w:t>
       </w:r>
       <w:r>
-        <w:t xml:space="preserve"> Allowed from both sides clicking Ready until both have signed; after one side signs, only the side still to sign can Reopen. The document does not change. The signing request is cancelled (any signature discarded), both clicks are cleared, the turn goes to the side that reopened, and spots are kept. After further changes both click Ready again, a new PDF is built, and both sign again.</w:t>
+        <w:t xml:space="preserve"> Allowed from both sides clicking Ready until both have signed; after one side signs, only the side still to sign can Reopen. The document does not change. The signing request is cancelled (any signature discarded), both clicks are cleared, the turn goes to the side that reopened, and spots are kept. After further changes both click Ready again, a new document to sign is built, and both sign again.</w:t>
       </w:r>
     </w:p>
     <w:p>
@@ -2963,7 +2963,7 @@
         <w:t xml:space="preserve">locked</w:t>
       </w:r>
       <w:r>
-        <w:t xml:space="preserve">, the signed PDF is stored and its hash saved. Both sides can download it.</w:t>
+        <w:t xml:space="preserve">, and the signed copy is made: the signatures at the spots or on the signature page, followed by a “Signing record” page (each signer’s name, email, side, time, method, IP address and browser; the fingerprint of the document signed; email confirmed by login code). It is stored and its fingerprint is saved and shown on the page. Comments and chat stay open. Both sides can download it.</w:t>
       </w:r>
     </w:p>
     <w:p>
@@ -3094,6 +3094,29 @@
       </w:r>
       <w:r>
         <w:t xml:space="preserve"> (to both sides; says if a signature was discarded).</w:t>
+      </w:r>
+    </w:p>
+    <w:p>
+      <w:pPr>
+        <w:pStyle w:val="ListParagraph"/>
+        <w:numPr>
+          <w:ilvl w:val="0"/>
+          <w:numId w:val="3"/>
+        </w:numPr>
+        <w:spacing w:after="80"/>
+      </w:pPr>
+      <w:r>
+        <w:t xml:space="preserve">Email on </w:t>
+      </w:r>
+      <w:r>
+        <w:rPr>
+          <w:b/>
+          <w:bCs/>
+        </w:rPr>
+        <w:t xml:space="preserve">signing start</w:t>
+      </w:r>
+      <w:r>
+        <w:t xml:space="preserve"> (to a chosen signer who hasn’t joined yet, with a sign-in link).</w:t>
       </w:r>
     </w:p>
     <w:p>
@@ -3497,7 +3520,7 @@
           </w:tcPr>
           <w:p>
             <w:r>
-              <w:t xml:space="preserve">id, contractId, role (PROPOSER | COUNTERPARTY), orgName, readyAt?, readyByUserId?, signerUserId?</w:t>
+              <w:t xml:space="preserve">id, contractId, role (PROPOSER | COUNTERPARTY), orgName, readyAt?, readyByUserId?, signerUserId?, signedAt?</w:t>
             </w:r>
           </w:p>
         </w:tc>
@@ -4161,7 +4184,7 @@
           </w:tcPr>
           <w:p>
             <w:r>
-              <w:t xml:space="preserve">id, contractId, versionId, provider, externalId, status (PENDING | COMPLETED | CANCELLED), signedFileKey?, signedDocHash</w:t>
+              <w:t xml:space="preserve">id, contractId, versionId, provider (“internal”), status (PENDING | COMPLETED | CANCELLED), unsignedFileKey, unsignedHash, signedFileKey?, signedDocHash?</w:t>
             </w:r>
           </w:p>
         </w:tc>
@@ -4182,6 +4205,74 @@
             </w:tcMar>
           </w:tcPr>
           <w:p/>
+        </w:tc>
+      </w:tr>
+      <w:tr>
+        <w:tc>
+          <w:tcPr>
+            <w:tcW w:type="dxa" w:w="1900"/>
+            <w:tcBorders>
+              <w:top w:val="single" w:color="BFBFBF" w:sz="4"/>
+              <w:left w:val="single" w:color="BFBFBF" w:sz="4"/>
+              <w:bottom w:val="single" w:color="BFBFBF" w:sz="4"/>
+              <w:right w:val="single" w:color="BFBFBF" w:sz="4"/>
+            </w:tcBorders>
+            <w:tcMar>
+              <w:top w:type="dxa" w:w="80"/>
+              <w:left w:type="dxa" w:w="120"/>
+              <w:bottom w:type="dxa" w:w="80"/>
+              <w:right w:type="dxa" w:w="120"/>
+            </w:tcMar>
+          </w:tcPr>
+          <w:p>
+            <w:r>
+              <w:t xml:space="preserve">Signature</w:t>
+            </w:r>
+          </w:p>
+        </w:tc>
+        <w:tc>
+          <w:tcPr>
+            <w:tcW w:type="dxa" w:w="4526"/>
+            <w:tcBorders>
+              <w:top w:val="single" w:color="BFBFBF" w:sz="4"/>
+              <w:left w:val="single" w:color="BFBFBF" w:sz="4"/>
+              <w:bottom w:val="single" w:color="BFBFBF" w:sz="4"/>
+              <w:right w:val="single" w:color="BFBFBF" w:sz="4"/>
+            </w:tcBorders>
+            <w:tcMar>
+              <w:top w:type="dxa" w:w="80"/>
+              <w:left w:type="dxa" w:w="120"/>
+              <w:bottom w:type="dxa" w:w="80"/>
+              <w:right w:type="dxa" w:w="120"/>
+            </w:tcMar>
+          </w:tcPr>
+          <w:p>
+            <w:r>
+              <w:t xml:space="preserve">id, requestId, partyId, userId, method (DRAWN | TYPED | UPLOADED), imageKey, ip, userAgent, documentHash, signedAt</w:t>
+            </w:r>
+          </w:p>
+        </w:tc>
+        <w:tc>
+          <w:tcPr>
+            <w:tcW w:type="dxa" w:w="2600"/>
+            <w:tcBorders>
+              <w:top w:val="single" w:color="BFBFBF" w:sz="4"/>
+              <w:left w:val="single" w:color="BFBFBF" w:sz="4"/>
+              <w:bottom w:val="single" w:color="BFBFBF" w:sz="4"/>
+              <w:right w:val="single" w:color="BFBFBF" w:sz="4"/>
+            </w:tcBorders>
+            <w:tcMar>
+              <w:top w:type="dxa" w:w="80"/>
+              <w:left w:type="dxa" w:w="120"/>
+              <w:bottom w:type="dxa" w:w="80"/>
+              <w:right w:type="dxa" w:w="120"/>
+            </w:tcMar>
+          </w:tcPr>
+          <w:p>
+            <w:r>
+              <w:t xml:space="preserve">one per side per signing round; image stored in S3</w:t>
+            </w:r>
+          </w:p>
         </w:tc>
       </w:tr>
       <w:tr>

</xml_diff>